<commit_message>
Update repository links with username
</commit_message>
<xml_diff>
--- a/docs/Final_Report.docx
+++ b/docs/Final_Report.docx
@@ -4005,7 +4005,7 @@
             <w:sz w:val="20"/>
             <w:szCs w:val="20"/>
           </w:rPr>
-          <w:t xml:space="preserve">github.com/USERNAME/pickle-stability</w:t>
+          <w:t xml:space="preserve">github.com/Abdulvohid0107/pickle-stability</w:t>
         </w:r>
       </w:hyperlink>
       <w:r>
@@ -4016,7 +4016,7 @@
           <w:sz w:val="16"/>
           <w:szCs w:val="16"/>
         </w:rPr>
-        <w:t xml:space="preserve">   (replace USERNAME after pushing)</w:t>
+        <w:t xml:space="preserve">   (replace Abdulvohid0107 after pushing)</w:t>
       </w:r>
     </w:p>
     <w:p>

</xml_diff>